<commit_message>
Update Antonio document: negotiation note, % milestones, advisory plans
- Add note that USD 10K is subject to negotiation outcome
- Replace milestone reference amounts with approximate percentages
- Remove inspection guarantees subsection (5.4)
- Add new section 6 with Imporlan pre-purchase advisory plans (Básico,
  Completo, Premium) per servicios-importacion page
- Renumber subsequent sections accordingly

https://claude.ai/code/session_01Y1DzYmKfKyrSdLZQDiHTmJ
</commit_message>
<xml_diff>
--- a/docs/clientes/Respuesta_Antonio_J29_1987.docx
+++ b/docs/clientes/Respuesta_Antonio_J29_1987.docx
@@ -102,7 +102,7 @@
           <w:color w:val="000000"/>
           <w:sz w:val="22"/>
         </w:rPr>
-        <w:t>Considerando un valor de compra en USA de USD 10.000 (publicado), el costo total del proceso completo —compra, inspección, importación e internación entregado en la V Región— asciende a:</w:t>
+        <w:t>Considerando un valor de compra en USA de USD 10.000 —bajo el supuesto de una negociación muy exitosa con el vendedor, ya que el monto final está sujeto al resultado de dicha negociación— el costo total del proceso completo (compra, inspección, importación e internación entregado en la V Región) asciende a:</w:t>
       </w:r>
     </w:p>
     <w:p>
@@ -588,6 +588,17 @@
       <w:r>
         <w:rPr>
           <w:rFonts w:ascii="Calibri" w:hAnsi="Calibri"/>
+          <w:b/>
+          <w:color w:val="0B3D91"/>
+          <w:sz w:val="20"/>
+        </w:rPr>
+        <w:t>Importante: este escenario asume que logramos una negociación muy exitosa cerrando la compra en USD 10.000. El valor final está sujeto al resultado de la negociación con el vendedor y, por tanto, el total puede variar.</w:t>
+      </w:r>
+    </w:p>
+    <w:p>
+      <w:r>
+        <w:rPr>
+          <w:rFonts w:ascii="Calibri" w:hAnsi="Calibri"/>
           <w:b w:val="0"/>
           <w:color w:val="555555"/>
           <w:sz w:val="20"/>
@@ -731,7 +742,7 @@
                 <w:color w:val="FFFFFF"/>
                 <w:sz w:val="20"/>
               </w:rPr>
-              <w:t>Monto referencial</w:t>
+              <w:t>% aprox. del total</w:t>
             </w:r>
           </w:p>
         </w:tc>
@@ -813,9 +824,9 @@
                 <w:rFonts w:ascii="Calibri" w:hAnsi="Calibri"/>
                 <w:sz w:val="20"/>
               </w:rPr>
-              <w:t>USD 800 – USD 1.500</w:t>
+              <w:t>Independiente</w:t>
               <w:br/>
-              <w:t>(según ubicación)</w:t>
+              <w:t>(no incluido en total)</w:t>
             </w:r>
           </w:p>
         </w:tc>
@@ -897,7 +908,7 @@
                 <w:rFonts w:ascii="Calibri" w:hAnsi="Calibri"/>
                 <w:sz w:val="20"/>
               </w:rPr>
-              <w:t>$9.200.000 (USD 10.000)</w:t>
+              <w:t>≈ 28%</w:t>
             </w:r>
           </w:p>
         </w:tc>
@@ -979,7 +990,7 @@
                 <w:rFonts w:ascii="Calibri" w:hAnsi="Calibri"/>
                 <w:sz w:val="20"/>
               </w:rPr>
-              <w:t>≈ $12.000.000</w:t>
+              <w:t>≈ 37%</w:t>
             </w:r>
           </w:p>
         </w:tc>
@@ -1061,7 +1072,7 @@
                 <w:rFonts w:ascii="Calibri" w:hAnsi="Calibri"/>
                 <w:sz w:val="20"/>
               </w:rPr>
-              <w:t>≈ $11.500.000</w:t>
+              <w:t>≈ 35%</w:t>
             </w:r>
           </w:p>
         </w:tc>
@@ -1088,7 +1099,7 @@
           <w:rFonts w:ascii="Calibri" w:hAnsi="Calibri"/>
           <w:color w:val="0B3D91"/>
         </w:rPr>
-        <w:t>5. Inspección pre-compra: alcance, valor y garantías</w:t>
+        <w:t>5. Inspección pre-compra: alcance y valor</w:t>
       </w:r>
     </w:p>
     <w:p>
@@ -1302,14 +1313,14 @@
     </w:p>
     <w:p>
       <w:pPr>
-        <w:pStyle w:val="Heading2"/>
+        <w:pStyle w:val="Heading1"/>
       </w:pPr>
       <w:r>
         <w:rPr>
           <w:rFonts w:ascii="Calibri" w:hAnsi="Calibri"/>
           <w:color w:val="0B3D91"/>
         </w:rPr>
-        <w:t>5.4 Garantías sobre la inspección</w:t>
+        <w:t>6. Asesoría Pre-Compra con búsqueda – Planes Imporlan</w:t>
       </w:r>
     </w:p>
     <w:p>
@@ -1320,69 +1331,214 @@
           <w:color w:val="000000"/>
           <w:sz w:val="22"/>
         </w:rPr>
-        <w:t>Es importante ser transparentes con este punto: una inspección pre-compra es una fotografía técnica del estado del velero en una fecha determinada. Las garantías que entrega son:</w:t>
+        <w:t>En tu caso ya tienes identificado el J/29 1987, por lo que aplica directamente el Plan Básico. Sin embargo, si en algún momento prefieres explorar más alternativas antes de cerrar una decisión, contamos con tres planes de servicio adaptados al nivel de acompañamiento que necesites:</w:t>
       </w:r>
     </w:p>
-    <w:p>
-      <w:pPr>
-        <w:pStyle w:val="ListBullet"/>
-      </w:pPr>
-      <w:r>
-        <w:rPr>
-          <w:rFonts w:ascii="Calibri" w:hAnsi="Calibri"/>
-          <w:b/>
-          <w:sz w:val="22"/>
-        </w:rPr>
-        <w:t xml:space="preserve">• </w:t>
-      </w:r>
-      <w:r>
-        <w:rPr>
-          <w:rFonts w:ascii="Calibri" w:hAnsi="Calibri"/>
-          <w:sz w:val="22"/>
-        </w:rPr>
-        <w:t>Responsabilidad profesional del surveyor: el inspector es un profesional acreditado (SAMS®/NAMS®) con seguro de responsabilidad civil (E&amp;O). Si omite un defecto evidente o detectable mediante los métodos estándar de inspección, responde profesionalmente.</w:t>
-      </w:r>
-    </w:p>
-    <w:p>
-      <w:pPr>
-        <w:pStyle w:val="ListBullet"/>
-      </w:pPr>
-      <w:r>
-        <w:rPr>
-          <w:rFonts w:ascii="Calibri" w:hAnsi="Calibri"/>
-          <w:b/>
-          <w:sz w:val="22"/>
-        </w:rPr>
-        <w:t xml:space="preserve">• </w:t>
-      </w:r>
-      <w:r>
-        <w:rPr>
-          <w:rFonts w:ascii="Calibri" w:hAnsi="Calibri"/>
-          <w:sz w:val="22"/>
-        </w:rPr>
-        <w:t>Argumentos para renegociar precio: cualquier hallazgo permite ajustar el valor final con el vendedor o solicitar reparaciones antes del cierre.</w:t>
-      </w:r>
-    </w:p>
-    <w:p>
-      <w:pPr>
-        <w:pStyle w:val="ListBullet"/>
-      </w:pPr>
-      <w:r>
-        <w:rPr>
-          <w:rFonts w:ascii="Calibri" w:hAnsi="Calibri"/>
-          <w:b/>
-          <w:sz w:val="22"/>
-        </w:rPr>
-        <w:t xml:space="preserve">• </w:t>
-      </w:r>
-      <w:r>
-        <w:rPr>
-          <w:rFonts w:ascii="Calibri" w:hAnsi="Calibri"/>
-          <w:sz w:val="22"/>
-        </w:rPr>
-        <w:t>Decisión informada: si el informe arroja problemas mayores, puedes desistir de la compra sin haber comprometido el grueso del presupuesto (solo perderías el costo de la inspección, ~USD 1.000).</w:t>
-      </w:r>
-    </w:p>
+    <w:tbl>
+      <w:tblPr>
+        <w:tblW w:type="auto" w:w="0"/>
+        <w:jc w:val="center"/>
+        <w:tblLook w:firstColumn="1" w:firstRow="1" w:lastColumn="0" w:lastRow="0" w:noHBand="0" w:noVBand="1" w:val="04A0"/>
+      </w:tblPr>
+      <w:tblGrid>
+        <w:gridCol w:w="3249"/>
+        <w:gridCol w:w="3249"/>
+        <w:gridCol w:w="3249"/>
+      </w:tblGrid>
+      <w:tr>
+        <w:tc>
+          <w:tcPr>
+            <w:tcW w:type="dxa" w:w="3249"/>
+            <w:shd w:val="clear" w:color="auto" w:fill="0B3D91"/>
+            <w:tcBorders>
+              <w:top w:val="single" w:sz="4" w:color="BFBFBF"/>
+              <w:left w:val="single" w:sz="4" w:color="BFBFBF"/>
+              <w:bottom w:val="single" w:sz="4" w:color="BFBFBF"/>
+              <w:right w:val="single" w:sz="4" w:color="BFBFBF"/>
+            </w:tcBorders>
+          </w:tcPr>
+          <w:p>
+            <w:pPr>
+              <w:jc w:val="center"/>
+            </w:pPr>
+            <w:r>
+              <w:rPr>
+                <w:rFonts w:ascii="Calibri" w:hAnsi="Calibri"/>
+                <w:b/>
+                <w:color w:val="FFFFFF"/>
+                <w:sz w:val="22"/>
+              </w:rPr>
+              <w:t>Plan Básico</w:t>
+            </w:r>
+          </w:p>
+        </w:tc>
+        <w:tc>
+          <w:tcPr>
+            <w:tcW w:type="dxa" w:w="3249"/>
+            <w:shd w:val="clear" w:color="auto" w:fill="0B3D91"/>
+            <w:tcBorders>
+              <w:top w:val="single" w:sz="4" w:color="BFBFBF"/>
+              <w:left w:val="single" w:sz="4" w:color="BFBFBF"/>
+              <w:bottom w:val="single" w:sz="4" w:color="BFBFBF"/>
+              <w:right w:val="single" w:sz="4" w:color="BFBFBF"/>
+            </w:tcBorders>
+          </w:tcPr>
+          <w:p>
+            <w:pPr>
+              <w:jc w:val="center"/>
+            </w:pPr>
+            <w:r>
+              <w:rPr>
+                <w:rFonts w:ascii="Calibri" w:hAnsi="Calibri"/>
+                <w:b/>
+                <w:color w:val="FFFFFF"/>
+                <w:sz w:val="22"/>
+              </w:rPr>
+              <w:t>Plan Completo</w:t>
+            </w:r>
+          </w:p>
+        </w:tc>
+        <w:tc>
+          <w:tcPr>
+            <w:tcW w:type="dxa" w:w="3249"/>
+            <w:shd w:val="clear" w:color="auto" w:fill="0B3D91"/>
+            <w:tcBorders>
+              <w:top w:val="single" w:sz="4" w:color="BFBFBF"/>
+              <w:left w:val="single" w:sz="4" w:color="BFBFBF"/>
+              <w:bottom w:val="single" w:sz="4" w:color="BFBFBF"/>
+              <w:right w:val="single" w:sz="4" w:color="BFBFBF"/>
+            </w:tcBorders>
+          </w:tcPr>
+          <w:p>
+            <w:pPr>
+              <w:jc w:val="center"/>
+            </w:pPr>
+            <w:r>
+              <w:rPr>
+                <w:rFonts w:ascii="Calibri" w:hAnsi="Calibri"/>
+                <w:b/>
+                <w:color w:val="FFFFFF"/>
+                <w:sz w:val="22"/>
+              </w:rPr>
+              <w:t>Plan Premium</w:t>
+            </w:r>
+          </w:p>
+        </w:tc>
+      </w:tr>
+      <w:tr>
+        <w:tc>
+          <w:tcPr>
+            <w:tcW w:type="dxa" w:w="3249"/>
+            <w:tcBorders>
+              <w:top w:val="single" w:sz="4" w:color="BFBFBF"/>
+              <w:left w:val="single" w:sz="4" w:color="BFBFBF"/>
+              <w:bottom w:val="single" w:sz="4" w:color="BFBFBF"/>
+              <w:right w:val="single" w:sz="4" w:color="BFBFBF"/>
+            </w:tcBorders>
+          </w:tcPr>
+          <w:p>
+            <w:r>
+              <w:rPr>
+                <w:rFonts w:ascii="Calibri" w:hAnsi="Calibri"/>
+                <w:sz w:val="20"/>
+              </w:rPr>
+              <w:t>Para clientes que ya tienen embarcación identificada (tu caso actual con el J/29).</w:t>
+              <w:br/>
+              <w:br/>
+              <w:t>Incluye:</w:t>
+              <w:br/>
+              <w:t>• Coordinación de inspección</w:t>
+              <w:br/>
+              <w:t>• Gestión de transporte marítimo</w:t>
+              <w:br/>
+              <w:t>• Desaduanaje</w:t>
+              <w:br/>
+              <w:t>• Nacionalización</w:t>
+              <w:br/>
+              <w:br/>
+              <w:t>Inversión: desde CLP $1.200.000 + gastos</w:t>
+            </w:r>
+          </w:p>
+        </w:tc>
+        <w:tc>
+          <w:tcPr>
+            <w:tcW w:type="dxa" w:w="3249"/>
+            <w:tcBorders>
+              <w:top w:val="single" w:sz="4" w:color="BFBFBF"/>
+              <w:left w:val="single" w:sz="4" w:color="BFBFBF"/>
+              <w:bottom w:val="single" w:sz="4" w:color="BFBFBF"/>
+              <w:right w:val="single" w:sz="4" w:color="BFBFBF"/>
+            </w:tcBorders>
+          </w:tcPr>
+          <w:p>
+            <w:r>
+              <w:rPr>
+                <w:rFonts w:ascii="Calibri" w:hAnsi="Calibri"/>
+                <w:sz w:val="20"/>
+              </w:rPr>
+              <w:t>Para clientes que necesitan búsqueda y gestión total.</w:t>
+              <w:br/>
+              <w:br/>
+              <w:t>Incluye:</w:t>
+              <w:br/>
+              <w:t>• Búsqueda especializada (hasta 10 opciones)</w:t>
+              <w:br/>
+              <w:t>• Inspección y negociación</w:t>
+              <w:br/>
+              <w:t>• Logística completa USA-Chile</w:t>
+              <w:br/>
+              <w:t>• Desaduanaje y nacionalización</w:t>
+              <w:br/>
+              <w:t>• Entrega a destino final</w:t>
+              <w:br/>
+              <w:t>• Seguimiento post-importación (3 meses)</w:t>
+              <w:br/>
+              <w:br/>
+              <w:t>Inversión: desde CLP $2.500.000 + gastos</w:t>
+            </w:r>
+          </w:p>
+        </w:tc>
+        <w:tc>
+          <w:tcPr>
+            <w:tcW w:type="dxa" w:w="3249"/>
+            <w:tcBorders>
+              <w:top w:val="single" w:sz="4" w:color="BFBFBF"/>
+              <w:left w:val="single" w:sz="4" w:color="BFBFBF"/>
+              <w:bottom w:val="single" w:sz="4" w:color="BFBFBF"/>
+              <w:right w:val="single" w:sz="4" w:color="BFBFBF"/>
+            </w:tcBorders>
+          </w:tcPr>
+          <w:p>
+            <w:r>
+              <w:rPr>
+                <w:rFonts w:ascii="Calibri" w:hAnsi="Calibri"/>
+                <w:sz w:val="20"/>
+              </w:rPr>
+              <w:t>Para yates y embarcaciones de alto valor.</w:t>
+              <w:br/>
+              <w:br/>
+              <w:t>Incluye:</w:t>
+              <w:br/>
+              <w:t>• Todo lo del Plan Completo</w:t>
+              <w:br/>
+              <w:t>• Visita presencial para inspección (1 viaje)</w:t>
+              <w:br/>
+              <w:t>• Coordinación de capitán profesional para sea trial</w:t>
+              <w:br/>
+              <w:t>• Gestión de upgrades o reparaciones pre-embarque</w:t>
+              <w:br/>
+              <w:t>• Seguro premium all-risk</w:t>
+              <w:br/>
+              <w:t>• Seguimiento post-importación (6 meses)</w:t>
+              <w:br/>
+              <w:br/>
+              <w:t>Inversión: a cotizar según embarcación</w:t>
+            </w:r>
+          </w:p>
+        </w:tc>
+      </w:tr>
+    </w:tbl>
+    <w:p/>
     <w:p>
       <w:r>
         <w:rPr>
@@ -1391,7 +1547,7 @@
           <w:color w:val="555555"/>
           <w:sz w:val="20"/>
         </w:rPr>
-        <w:t>Lo que la inspección NO garantiza: defectos ocultos no detectables sin desarme, fallas futuras del motor o equipos, ni el comportamiento del velero después de la compra. Por esto recomendamos siempre que, además de la inspección, se contrate un seguro de embarcación que cubra el período de traslado y posterior uso en Chile.</w:t>
+        <w:t>Recomendación para tu caso: dado que ya elegiste el velero, el Plan Básico es el más eficiente; la cotización de CLP $32.697.440 ya está construida sobre esta base. Si más adelante prefieres comparar el J/29 con otras alternativas en USA antes de decidir, podemos migrar al Plan Completo y ampliar la búsqueda hasta 10 opciones que cumplan tus criterios (eslora, año, presupuesto, ubicación).</w:t>
       </w:r>
     </w:p>
     <w:p>
@@ -1403,7 +1559,7 @@
           <w:rFonts w:ascii="Calibri" w:hAnsi="Calibri"/>
           <w:color w:val="0B3D91"/>
         </w:rPr>
-        <w:t>6. Negociación con el vendedor</w:t>
+        <w:t>7. Negociación con el vendedor</w:t>
       </w:r>
     </w:p>
     <w:p>
@@ -1526,7 +1682,7 @@
           <w:rFonts w:ascii="Calibri" w:hAnsi="Calibri"/>
           <w:color w:val="0B3D91"/>
         </w:rPr>
-        <w:t>7. Transparencia: FEE Imporlan</w:t>
+        <w:t>8. Transparencia: FEE Imporlan</w:t>
       </w:r>
     </w:p>
     <w:p>
@@ -1574,7 +1730,7 @@
           <w:rFonts w:ascii="Calibri" w:hAnsi="Calibri"/>
           <w:color w:val="0B3D91"/>
         </w:rPr>
-        <w:t>8. Próximos pasos sugeridos</w:t>
+        <w:t>9. Próximos pasos sugeridos</w:t>
       </w:r>
     </w:p>
     <w:p>

</xml_diff>